<commit_message>
feat: initialize Agent_V2 project with resume documents, agent brain data, and workspace configuration
</commit_message>
<xml_diff>
--- a/documents/Resume.docx
+++ b/documents/Resume.docx
@@ -520,7 +520,15 @@
           <w:sz w:val="24"/>
           <w:szCs w:val="24"/>
         </w:rPr>
-        <w:t>Northeastern University, Boston, MA  |  August 2022 – May 2023</w:t>
+        <w:t xml:space="preserve">Northeastern University, Boston, MA  |  August 2022 – </w:t>
+      </w:r>
+      <w:r>
+        <w:rPr>
+          <w:rFonts w:ascii="Times New Roman" w:hAnsi="Times New Roman" w:cs="Times New Roman"/>
+          <w:sz w:val="24"/>
+          <w:szCs w:val="24"/>
+        </w:rPr>
+        <w:t>Present</w:t>
       </w:r>
     </w:p>
     <w:p>
@@ -721,44 +729,16 @@
           <w:sz w:val="24"/>
           <w:szCs w:val="24"/>
         </w:rPr>
-        <w:t xml:space="preserve">Agent Development Kit (ADK), Machine Learning, Gemini, </w:t>
-      </w:r>
-      <w:proofErr w:type="spellStart"/>
-      <w:r>
-        <w:rPr>
-          <w:rFonts w:ascii="Times New Roman" w:hAnsi="Times New Roman" w:cs="Times New Roman"/>
-          <w:sz w:val="24"/>
-          <w:szCs w:val="24"/>
-        </w:rPr>
-        <w:t>Ollama</w:t>
-      </w:r>
-      <w:proofErr w:type="spellEnd"/>
-      <w:r>
-        <w:rPr>
-          <w:rFonts w:ascii="Times New Roman" w:hAnsi="Times New Roman" w:cs="Times New Roman"/>
-          <w:sz w:val="24"/>
-          <w:szCs w:val="24"/>
-        </w:rPr>
-        <w:t>, Kaggle</w:t>
-      </w:r>
-      <w:r>
-        <w:rPr>
-          <w:rFonts w:ascii="Times New Roman" w:hAnsi="Times New Roman" w:cs="Times New Roman"/>
-          <w:sz w:val="24"/>
-          <w:szCs w:val="24"/>
-        </w:rPr>
-        <w:t xml:space="preserve">, </w:t>
-      </w:r>
-      <w:proofErr w:type="spellStart"/>
-      <w:r>
-        <w:rPr>
-          <w:rFonts w:ascii="Times New Roman" w:hAnsi="Times New Roman" w:cs="Times New Roman"/>
-          <w:sz w:val="24"/>
-          <w:szCs w:val="24"/>
-        </w:rPr>
-        <w:t>LangChain</w:t>
-      </w:r>
-      <w:proofErr w:type="spellEnd"/>
+        <w:t>Agent Development Kit (ADK), Machine Learning, Gemini, Ollama, Kaggle</w:t>
+      </w:r>
+      <w:r>
+        <w:rPr>
+          <w:rFonts w:ascii="Times New Roman" w:hAnsi="Times New Roman" w:cs="Times New Roman"/>
+          <w:sz w:val="24"/>
+          <w:szCs w:val="24"/>
+        </w:rPr>
+        <w:t>, LangChain</w:t>
+      </w:r>
     </w:p>
     <w:p>
       <w:pPr>

</xml_diff>